<commit_message>
feat: upgrade Quanzhou itinerary to High-Speed Rail and deep Minnan culinary focus
</commit_message>
<xml_diff>
--- a/dist_quanzhou/travel_plan.docx
+++ b/dist_quanzhou/travel_plan.docx
@@ -55,7 +55,7 @@
                 <w:color w:val="FFFFFF"/>
                 <w:sz w:val="32"/>
               </w:rPr>
-              <w:t>泉州“半城烟火半城仙”世遗古城与簪花亲子慢游规划</w:t>
+              <w:t>泉州“寻味闽南·高铁慢游”世遗美食与簪花亲子度假保姆级规划</w:t>
             </w:r>
           </w:p>
           <w:p>
@@ -67,7 +67,7 @@
                 <w:color w:val="CBD5E1"/>
                 <w:sz w:val="19"/>
               </w:rPr>
-              <w:t>2 岁女宝 ＋ 50+ 外婆 ＋ 父母的 3 天 2 晚 闽南世遗非遗文化与滨海度假慢游。</w:t>
+              <w:t>2 岁女宝 ＋ 50+ 外婆 ＋ 父母的 3 天 2 晚 杭州东站直达高铁 · 极致闽南老饕美食与世遗非遗度假之旅。</w:t>
             </w:r>
           </w:p>
         </w:tc>
@@ -1265,7 +1265,7 @@
                 <w:color w:val="0F172A"/>
                 <w:sz w:val="21"/>
               </w:rPr>
-              <w:t>【Day 1】</w:t>
+              <w:t>【Day】</w:t>
             </w:r>
             <w:r>
               <w:rPr>
@@ -1273,7 +1273,7 @@
                 <w:color w:val="475569"/>
                 <w:sz w:val="19"/>
               </w:rPr>
-              <w:t xml:space="preserve"> 错峰启程 ➔ 途径商场休整补能 ➔ 酒店大床深度午睡 ➔ 轻松夜游</w:t>
+              <w:t xml:space="preserve"> 1 · 杭州高铁直达 ➔ 古厝入住 ➔ 老字号面线糊 ➔ 大床午睡 ➔ 斯丹姜母鸭</w:t>
             </w:r>
           </w:p>
           <w:p>
@@ -1286,14 +1286,14 @@
                 <w:color w:val="1E293B"/>
                 <w:sz w:val="17"/>
               </w:rPr>
-              <w:t>• 10:00 - 11:45：</w:t>
+              <w:t>• 08:30 - 12:45：</w:t>
             </w:r>
             <w:r>
               <w:rPr>
                 <w:color w:val="475569"/>
                 <w:sz w:val="17"/>
               </w:rPr>
-              <w:t>错峰自驾出发，避开早高峰，沿风景优美的高速平稳前行。</w:t>
+              <w:t>**【高铁平稳直达】**：杭州东站乘高铁直达泉州站（宝宝车上吃果泥看绘本，长辈平稳休息）。</w:t>
             </w:r>
           </w:p>
           <w:p>
@@ -1306,14 +1306,14 @@
                 <w:color w:val="1E293B"/>
                 <w:sz w:val="17"/>
               </w:rPr>
-              <w:t>• 11:45 - 13:15：</w:t>
+              <w:t>• 12:45 - 13:30：</w:t>
             </w:r>
             <w:r>
               <w:rPr>
                 <w:color w:val="475569"/>
                 <w:sz w:val="17"/>
               </w:rPr>
-              <w:t>途径大型综合商场休整：地库补能/停车 ＋ 吃当地地道特色午餐 ＋ 五星母婴室换尿布。</w:t>
+              <w:t>**【出站打车直达西街】**：车站出站打车 20 分钟直达西街客栈放行李。</w:t>
             </w:r>
           </w:p>
           <w:p>
@@ -1326,14 +1326,14 @@
                 <w:color w:val="1E293B"/>
                 <w:sz w:val="17"/>
               </w:rPr>
-              <w:t>• 13:15 - 14:15：</w:t>
+              <w:t>• 13:30 - 14:15：</w:t>
             </w:r>
             <w:r>
               <w:rPr>
                 <w:color w:val="475569"/>
                 <w:sz w:val="17"/>
               </w:rPr>
-              <w:t>午后轻量游 1 小时 (大学漫步/自然公园/湖畔林荫道，推车无障碍友好)。</w:t>
+              <w:t>**【首顿极鲜午餐】**：客栈旁吃 **【水门国仔老牌面线糊】**（大骨海蚌熬煮高汤、面线入口即化，给宝宝加瘦肉豆腐，大人加油条醋肉）。</w:t>
             </w:r>
           </w:p>
           <w:p>
@@ -1353,7 +1353,7 @@
                 <w:color w:val="475569"/>
                 <w:sz w:val="17"/>
               </w:rPr>
-              <w:t>抵达度假酒店办理入住，房间大床深度午睡 2 小时彻底回血！</w:t>
+              <w:t>**【古厝大床深度午睡】**：拉上遮光窗帘在大床舒舒服服睡满 2 小时彻底回血！</w:t>
             </w:r>
           </w:p>
           <w:p>
@@ -1366,14 +1366,34 @@
                 <w:color w:val="1E293B"/>
                 <w:sz w:val="17"/>
               </w:rPr>
-              <w:t>• 17:00 - 20:30：</w:t>
+              <w:t>• 16:30 - 18:30：</w:t>
             </w:r>
             <w:r>
               <w:rPr>
                 <w:color w:val="475569"/>
                 <w:sz w:val="17"/>
               </w:rPr>
-              <w:t>景区商业街/湖滨漫步夜游，品尝精致地道晚餐，早回房休息备战次日。</w:t>
+              <w:t>**【开元寺红墙漫步】**：推车漫步千年开元寺看东西双塔日落（红砖古榕，平缓无台阶）。</w:t>
+            </w:r>
+          </w:p>
+          <w:p>
+            <w:pPr>
+              <w:spacing w:before="40" w:after="40"/>
+            </w:pPr>
+            <w:r>
+              <w:rPr>
+                <w:b/>
+                <w:color w:val="1E293B"/>
+                <w:sz w:val="17"/>
+              </w:rPr>
+              <w:t>• 18:30 - 20:30：</w:t>
+            </w:r>
+            <w:r>
+              <w:rPr>
+                <w:color w:val="475569"/>
+                <w:sz w:val="17"/>
+              </w:rPr>
+              <w:t>**【晚餐：斯丹姜母鸭】**：砂锅现煲老番鸭（老姜焦香脱骨，肉汁拌饭一绝），饭后吃 **【庄阿姨芋头饼】** 与西街钟楼夜景。</w:t>
             </w:r>
           </w:p>
         </w:tc>
@@ -1424,7 +1444,7 @@
                 <w:color w:val="0F172A"/>
                 <w:sz w:val="21"/>
               </w:rPr>
-              <w:t>【Day 2】</w:t>
+              <w:t>【Day】</w:t>
             </w:r>
             <w:r>
               <w:rPr>
@@ -1432,7 +1452,7 @@
                 <w:color w:val="475569"/>
                 <w:sz w:val="19"/>
               </w:rPr>
-              <w:t xml:space="preserve"> 核心景区/乐园沉浸体验（双模式午睡 ＋ 精彩夜秀）</w:t>
+              <w:t xml:space="preserve"> 2 · 蟳埔女三代簪花写真 ➔ 临家黑珍珠闽南菜 ➔ 大床午睡 ➔ 四果汤与肉粽</w:t>
             </w:r>
           </w:p>
           <w:p>
@@ -1445,14 +1465,14 @@
                 <w:color w:val="1E293B"/>
                 <w:sz w:val="17"/>
               </w:rPr>
-              <w:t>• 07:30 - 08:55：</w:t>
+              <w:t>• 08:30 - 09:30：</w:t>
             </w:r>
             <w:r>
               <w:rPr>
                 <w:color w:val="475569"/>
                 <w:sz w:val="17"/>
               </w:rPr>
-              <w:t>酒店自助早餐吃饱 ➔ 乘专属班车直达景区 ➔ 快速检票入园。</w:t>
+              <w:t>**【早餐】**：客栈吃地道花生汤配油条、原味手工肉包。</w:t>
             </w:r>
           </w:p>
           <w:p>
@@ -1465,14 +1485,14 @@
                 <w:color w:val="1E293B"/>
                 <w:sz w:val="17"/>
               </w:rPr>
-              <w:t>• 09:00 - 12:00：</w:t>
+              <w:t>• 09:30 - 12:30：</w:t>
             </w:r>
             <w:r>
               <w:rPr>
                 <w:color w:val="475569"/>
                 <w:sz w:val="17"/>
               </w:rPr>
-              <w:t>黄金早场体验：优先打卡温和低龄、免排队核心景观。</w:t>
+              <w:t>**【蟳埔非遗簪花围】**：打车 20 分钟前往【蟳埔民俗渔村】，外婆、妈妈与宝宝三代体验“簪花围”（头戴鲜花，在海蛎壳蚵壳厝前拍温馨母女祖孙大片）。</w:t>
             </w:r>
           </w:p>
           <w:p>
@@ -1485,14 +1505,14 @@
                 <w:color w:val="1E293B"/>
                 <w:sz w:val="17"/>
               </w:rPr>
-              <w:t>• 12:15 - 13:45：</w:t>
+              <w:t>• 12:30 - 14:00：</w:t>
             </w:r>
             <w:r>
               <w:rPr>
                 <w:color w:val="475569"/>
                 <w:sz w:val="17"/>
               </w:rPr>
-              <w:t>享用特色能量午餐 ＋ 休息室/母婴室换干爽尿布。</w:t>
+              <w:t>**【午餐：临家闽南菜 (黑珍珠/必吃榜)】**：吃翔安原味土鸡汤（金黄浓郁）、手打海鲜豆腐煲、同安封肉（软烂肥美）、清蒸红鲟。</w:t>
             </w:r>
           </w:p>
           <w:p>
@@ -1505,14 +1525,14 @@
                 <w:color w:val="1E293B"/>
                 <w:sz w:val="17"/>
               </w:rPr>
-              <w:t>• 14:00 - 16:00：</w:t>
+              <w:t>• 14:00 - 16:30：</w:t>
             </w:r>
             <w:r>
               <w:rPr>
                 <w:color w:val="475569"/>
                 <w:sz w:val="17"/>
               </w:rPr>
-              <w:t>黄金午睡 (双模式)：长辈带宝宝回房大床睡 / 留园推车睡 ＋ 爸妈走单人通道畅玩大项目！</w:t>
+              <w:t>**【古厝客栈大床午睡】**：避开正午烈日，回客栈静谧午睡 2.5 小时。</w:t>
             </w:r>
           </w:p>
           <w:p>
@@ -1525,14 +1545,14 @@
                 <w:color w:val="1E293B"/>
                 <w:sz w:val="17"/>
               </w:rPr>
-              <w:t>• 16:15 - 19:30：</w:t>
+              <w:t>• 16:30 - 18:30：</w:t>
             </w:r>
             <w:r>
               <w:rPr>
                 <w:color w:val="475569"/>
                 <w:sz w:val="17"/>
               </w:rPr>
-              <w:t>下午巡游表演 ➔ 室内清凉大剧场看视效大秀 ➔ 清淡养生晚餐。</w:t>
+              <w:t>**【晋江五店市传统街区】**：漫步闽南红砖大厝，古色古香，推车极顺畅。</w:t>
             </w:r>
           </w:p>
           <w:p>
@@ -1545,14 +1565,14 @@
                 <w:color w:val="1E293B"/>
                 <w:sz w:val="17"/>
               </w:rPr>
-              <w:t>• 20:45 - 21:30：</w:t>
+              <w:t>• 18:30 - 20:30：</w:t>
             </w:r>
             <w:r>
               <w:rPr>
                 <w:color w:val="475569"/>
                 <w:sz w:val="17"/>
               </w:rPr>
-              <w:t>观赏压轴璀璨夜景/灯光秀 ➔ 散场极速出园乘车回房泡澡安睡！</w:t>
+              <w:t>**【晚餐小吃巡礼】**：**【秉正堂石花膏四果汤】**（天然石花草清甜消暑） ＋ **【侯阿婆烧肉粽】**（淋香浓花生酱）。</w:t>
             </w:r>
           </w:p>
         </w:tc>
@@ -1603,7 +1623,7 @@
                 <w:color w:val="0F172A"/>
                 <w:sz w:val="21"/>
               </w:rPr>
-              <w:t>【Day 3】</w:t>
+              <w:t>【Day】</w:t>
             </w:r>
             <w:r>
               <w:rPr>
@@ -1611,7 +1631,7 @@
                 <w:color w:val="475569"/>
                 <w:sz w:val="19"/>
               </w:rPr>
-              <w:t xml:space="preserve"> 室内文化展馆探索 ➔ 地方老字号午餐 ➔ 地标合影 ➔ 顺畅返程</w:t>
+              <w:t xml:space="preserve"> 3 · 府文庙清幽漫步 ➔ 远芳小笼与牛肉羹 ➔ 高铁平稳返杭</w:t>
             </w:r>
           </w:p>
           <w:p>
@@ -1624,14 +1644,14 @@
                 <w:color w:val="1E293B"/>
                 <w:sz w:val="17"/>
               </w:rPr>
-              <w:t>• 08:30 - 09:30：</w:t>
+              <w:t>• 09:00 - 10:30：</w:t>
             </w:r>
             <w:r>
               <w:rPr>
                 <w:color w:val="475569"/>
                 <w:sz w:val="17"/>
               </w:rPr>
-              <w:t>早餐后行李装车退房，自驾直达高品质室内展馆。</w:t>
+              <w:t>**【睡到自然醒】**：悠闲早餐退房，行李寄存在客栈前台。</w:t>
             </w:r>
           </w:p>
           <w:p>
@@ -1644,14 +1664,14 @@
                 <w:color w:val="1E293B"/>
                 <w:sz w:val="17"/>
               </w:rPr>
-              <w:t>• 09:30 - 11:45：</w:t>
+              <w:t>• 10:30 - 12:00：</w:t>
             </w:r>
             <w:r>
               <w:rPr>
                 <w:color w:val="475569"/>
                 <w:sz w:val="17"/>
               </w:rPr>
-              <w:t>室内展馆沉浸式探索 2 小时 (恒温无障碍，推车推行顺畅，老幼舒适)。</w:t>
+              <w:t>**【府文庙与清净寺】**：绿树成荫，古木参天，安静清幽，宝宝喂鸽子。</w:t>
             </w:r>
           </w:p>
           <w:p>
@@ -1671,7 +1691,7 @@
                 <w:color w:val="475569"/>
                 <w:sz w:val="17"/>
               </w:rPr>
-              <w:t>地标商圈品尝老字号非遗风味午餐。</w:t>
+              <w:t>**【午餐：远芳小笼包 ＋ 泉州牛肉羹】**：现包多汁小笼包配鲜滑牛肉羹汤、亚佛润饼菜。</w:t>
             </w:r>
           </w:p>
           <w:p>
@@ -1684,14 +1704,14 @@
                 <w:color w:val="1E293B"/>
                 <w:sz w:val="17"/>
               </w:rPr>
-              <w:t>• 13:30 - 15:30：</w:t>
+              <w:t>• 13:30 - 14:15：</w:t>
             </w:r>
             <w:r>
               <w:rPr>
                 <w:color w:val="475569"/>
                 <w:sz w:val="17"/>
               </w:rPr>
-              <w:t>地标滨江/城市广场拍全家福大片 ＋ 沿亲水林荫道推车江风午睡。</w:t>
+              <w:t>取行李打车前往泉州高铁站。</w:t>
             </w:r>
           </w:p>
           <w:p>
@@ -1704,14 +1724,14 @@
                 <w:color w:val="1E293B"/>
                 <w:sz w:val="17"/>
               </w:rPr>
-              <w:t>• 15:30 - 18:00：</w:t>
+              <w:t>• 14:30 - 18:45：</w:t>
             </w:r>
             <w:r>
               <w:rPr>
                 <w:color w:val="475569"/>
                 <w:sz w:val="17"/>
               </w:rPr>
-              <w:t>提前启程返程（避开周末晚高峰大拥堵），准时到家吃热腾腾晚饭！</w:t>
+              <w:t>**【高铁顺畅返杭】**：乘坐舒适高铁直达杭州东站，19:00 准时到家洗热水澡吃家常晚饭！</w:t>
             </w:r>
           </w:p>
         </w:tc>

</xml_diff>

<commit_message>
feat: customize Quanzhou plan for 5yo girl and parents (Puppet show, Princess ZanHua, and Beach digging)
</commit_message>
<xml_diff>
--- a/dist_quanzhou/travel_plan.docx
+++ b/dist_quanzhou/travel_plan.docx
@@ -55,7 +55,7 @@
                 <w:color w:val="FFFFFF"/>
                 <w:sz w:val="32"/>
               </w:rPr>
-              <w:t>泉州“寻味闽南·高铁慢游”世遗美食与簪花亲子度假保姆级规划</w:t>
+              <w:t>泉州“寻味闽南·簪花木偶”5岁小公主亲子高铁度假保姆级规划</w:t>
             </w:r>
           </w:p>
           <w:p>
@@ -67,7 +67,7 @@
                 <w:color w:val="CBD5E1"/>
                 <w:sz w:val="19"/>
               </w:rPr>
-              <w:t>2 岁女宝 ＋ 50+ 外婆 ＋ 父母的 3 天 2 晚 杭州东站直达高铁 · 极致闽南老饕美食与世遗非遗度假之旅。</w:t>
+              <w:t>5 岁女娃 ＋ 父母（年轻三口之家）的 3 天 2 晚 杭州东站高铁直达 · 极致闽南老饕美食、非遗提线木偶与蟳埔小公主簪花之旅。</w:t>
             </w:r>
           </w:p>
         </w:tc>
@@ -1273,7 +1273,7 @@
                 <w:color w:val="475569"/>
                 <w:sz w:val="19"/>
               </w:rPr>
-              <w:t xml:space="preserve"> 1 · 杭州高铁直达 ➔ 古厝入住 ➔ 老字号面线糊 ➔ 大床午睡 ➔ 斯丹姜母鸭</w:t>
+              <w:t xml:space="preserve"> 1 · 高铁直达 ➔ 古厝入住 ➔ 鲜美面线糊 ➔ 午睡 ➔ 木偶戏 ➔ 姜母鸭</w:t>
             </w:r>
           </w:p>
           <w:p>
@@ -1293,7 +1293,7 @@
                 <w:color w:val="475569"/>
                 <w:sz w:val="17"/>
               </w:rPr>
-              <w:t>**【高铁平稳直达】**：杭州东站乘高铁直达泉州站（宝宝车上吃果泥看绘本，长辈平稳休息）。</w:t>
+              <w:t>**【高铁平稳直达】**：杭州东站乘高铁直达泉州站（5岁女娃车上看绘本、画画、吃水果零食）。</w:t>
             </w:r>
           </w:p>
           <w:p>
@@ -1313,7 +1313,7 @@
                 <w:color w:val="475569"/>
                 <w:sz w:val="17"/>
               </w:rPr>
-              <w:t>**【出站打车直达西街】**：车站出站打车 20 分钟直达西街客栈放行李。</w:t>
+              <w:t>**【出站打车直达西街】**：打车 20 分钟直达古厝客栈办理入住。</w:t>
             </w:r>
           </w:p>
           <w:p>
@@ -1333,7 +1333,7 @@
                 <w:color w:val="475569"/>
                 <w:sz w:val="17"/>
               </w:rPr>
-              <w:t>**【首顿极鲜午餐】**：客栈旁吃 **【水门国仔老牌面线糊】**（大骨海蚌熬煮高汤、面线入口即化，给宝宝加瘦肉豆腐，大人加油条醋肉）。</w:t>
+              <w:t>**【首顿老饕午餐】**：吃 **【水门国仔老牌面线糊】**（鲜浓大骨海鲜汤底，给孩子加香脆炸醋肉、大虾仁、油条段，泡汤吃极其过瘾！）。</w:t>
             </w:r>
           </w:p>
           <w:p>
@@ -1346,14 +1346,14 @@
                 <w:color w:val="1E293B"/>
                 <w:sz w:val="17"/>
               </w:rPr>
-              <w:t>• 14:15 - 16:30：</w:t>
+              <w:t>• 14:15 - 16:00：</w:t>
             </w:r>
             <w:r>
               <w:rPr>
                 <w:color w:val="475569"/>
                 <w:sz w:val="17"/>
               </w:rPr>
-              <w:t>**【古厝大床深度午睡】**：拉上遮光窗帘在大床舒舒服服睡满 2 小时彻底回血！</w:t>
+              <w:t>**【古厝大床舒适午睡】**：吹空调深度小憩 1.5～2 小时彻底回血。</w:t>
             </w:r>
           </w:p>
           <w:p>
@@ -1366,14 +1366,14 @@
                 <w:color w:val="1E293B"/>
                 <w:sz w:val="17"/>
               </w:rPr>
-              <w:t>• 16:30 - 18:30：</w:t>
+              <w:t>• 16:30 - 18:00：</w:t>
             </w:r>
             <w:r>
               <w:rPr>
                 <w:color w:val="475569"/>
                 <w:sz w:val="17"/>
               </w:rPr>
-              <w:t>**【开元寺红墙漫步】**：推车漫步千年开元寺看东西双塔日落（红砖古榕，平缓无台阶）。</w:t>
+              <w:t>**【泉州非遗提线木偶戏】**：看国家级非遗《赵飞燕》《钟馗醉酒》，演出后带娃到台前亲手拉线体验木偶跳舞。</w:t>
             </w:r>
           </w:p>
           <w:p>
@@ -1393,7 +1393,7 @@
                 <w:color w:val="475569"/>
                 <w:sz w:val="17"/>
               </w:rPr>
-              <w:t>**【晚餐：斯丹姜母鸭】**：砂锅现煲老番鸭（老姜焦香脱骨，肉汁拌饭一绝），饭后吃 **【庄阿姨芋头饼】** 与西街钟楼夜景。</w:t>
+              <w:t>**【晚餐：斯丹姜母鸭】**：砂锅现煲老番鸭，焦香嫩肉撕碎拌白饭，饭后吃 **【庄阿姨紫薯芋头饼】**，漫步西街看钟楼亮灯。</w:t>
             </w:r>
           </w:p>
         </w:tc>
@@ -1452,7 +1452,7 @@
                 <w:color w:val="475569"/>
                 <w:sz w:val="19"/>
               </w:rPr>
-              <w:t xml:space="preserve"> 2 · 蟳埔女三代簪花写真 ➔ 临家黑珍珠闽南菜 ➔ 大床午睡 ➔ 四果汤与肉粽</w:t>
+              <w:t xml:space="preserve"> 2 · 蟳埔女小公主簪花 ➔ 临家闽南大餐 ➔ 午睡 ➔ 黄金海岸挖沙踏浪 ➔ 四果汤</w:t>
             </w:r>
           </w:p>
           <w:p>
@@ -1472,7 +1472,7 @@
                 <w:color w:val="475569"/>
                 <w:sz w:val="17"/>
               </w:rPr>
-              <w:t>**【早餐】**：客栈吃地道花生汤配油条、原味手工肉包。</w:t>
+              <w:t>**【早餐】**：客栈吃地道花生汤、外酥里嫩葱烧饼、原味蒸肉包。</w:t>
             </w:r>
           </w:p>
           <w:p>
@@ -1492,7 +1492,7 @@
                 <w:color w:val="475569"/>
                 <w:sz w:val="17"/>
               </w:rPr>
-              <w:t>**【蟳埔非遗簪花围】**：打车 20 分钟前往【蟳埔民俗渔村】，外婆、妈妈与宝宝三代体验“簪花围”（头戴鲜花，在海蛎壳蚵壳厝前拍温馨母女祖孙大片）。</w:t>
+              <w:t>**【蟳埔非遗小公主簪花围】**：打车前往蟳埔村，妈妈和 5 岁女娃换上精致马面裙，头戴五彩鲜花花环，在海蛎壳蚵壳厝前拍美美的童话母女大片！</w:t>
             </w:r>
           </w:p>
           <w:p>
@@ -1512,7 +1512,7 @@
                 <w:color w:val="475569"/>
                 <w:sz w:val="17"/>
               </w:rPr>
-              <w:t>**【午餐：临家闽南菜 (黑珍珠/必吃榜)】**：吃翔安原味土鸡汤（金黄浓郁）、手打海鲜豆腐煲、同安封肉（软烂肥美）、清蒸红鲟。</w:t>
+              <w:t>**【午餐：临家闽南菜 (黑珍珠/必吃榜)】**：吃翔安原味土鸡汤、手打海鲜豆腐煲、脆皮手撕鸡、同安封肉拌饭。</w:t>
             </w:r>
           </w:p>
           <w:p>
@@ -1525,14 +1525,14 @@
                 <w:color w:val="1E293B"/>
                 <w:sz w:val="17"/>
               </w:rPr>
-              <w:t>• 14:00 - 16:30：</w:t>
+              <w:t>• 14:00 - 15:30：</w:t>
             </w:r>
             <w:r>
               <w:rPr>
                 <w:color w:val="475569"/>
                 <w:sz w:val="17"/>
               </w:rPr>
-              <w:t>**【古厝客栈大床午睡】**：避开正午烈日，回客栈静谧午睡 2.5 小时。</w:t>
+              <w:t>**【回客栈午休避烈日】**：避开正午烈日，客栈房间看动画休整。</w:t>
             </w:r>
           </w:p>
           <w:p>
@@ -1545,14 +1545,14 @@
                 <w:color w:val="1E293B"/>
                 <w:sz w:val="17"/>
               </w:rPr>
-              <w:t>• 16:30 - 18:30：</w:t>
+              <w:t>• 16:00 - 18:30：</w:t>
             </w:r>
             <w:r>
               <w:rPr>
                 <w:color w:val="475569"/>
                 <w:sz w:val="17"/>
               </w:rPr>
-              <w:t>**【晋江五店市传统街区】**：漫步闽南红砖大厝，古色古香，推车极顺畅。</w:t>
+              <w:t>**【青山湾/崇武海岸踏浪挖沙】**：打车直达海边沙滩，带小桶小铲子挖沙抓小螃蟹、踩海浪看日落晚霞。</w:t>
             </w:r>
           </w:p>
           <w:p>
@@ -1572,7 +1572,7 @@
                 <w:color w:val="475569"/>
                 <w:sz w:val="17"/>
               </w:rPr>
-              <w:t>**【晚餐小吃巡礼】**：**【秉正堂石花膏四果汤】**（天然石花草清甜消暑） ＋ **【侯阿婆烧肉粽】**（淋香浓花生酱）。</w:t>
+              <w:t>**【晚餐小吃盛宴】**：**【秉正堂石花膏】**（让孩子自己挑选 4 种小料：红豆、芋圆、西瓜、阿达子） ＋ **【侯阿婆烧肉粽】**。</w:t>
             </w:r>
           </w:p>
         </w:tc>
@@ -1631,7 +1631,7 @@
                 <w:color w:val="475569"/>
                 <w:sz w:val="19"/>
               </w:rPr>
-              <w:t xml:space="preserve"> 3 · 府文庙清幽漫步 ➔ 远芳小笼与牛肉羹 ➔ 高铁平稳返杭</w:t>
+              <w:t xml:space="preserve"> 3 · 开元寺喂鸽子 ➔ 远芳小笼包与牛肉羹 ➔ 轻松高铁返杭</w:t>
             </w:r>
           </w:p>
           <w:p>
@@ -1651,7 +1651,7 @@
                 <w:color w:val="475569"/>
                 <w:sz w:val="17"/>
               </w:rPr>
-              <w:t>**【睡到自然醒】**：悠闲早餐退房，行李寄存在客栈前台。</w:t>
+              <w:t>**【睡到自然醒】**：悠闲早餐后退房寄存行李。</w:t>
             </w:r>
           </w:p>
           <w:p>
@@ -1671,7 +1671,7 @@
                 <w:color w:val="475569"/>
                 <w:sz w:val="17"/>
               </w:rPr>
-              <w:t>**【府文庙与清净寺】**：绿树成荫，古木参天，安静清幽，宝宝喂鸽子。</w:t>
+              <w:t>**【千年开元寺漫步】**：看东西双塔，大草坪上喂白鸽、看古榕树松鼠跳跃，红墙前拍全家福。</w:t>
             </w:r>
           </w:p>
           <w:p>
@@ -1691,7 +1691,7 @@
                 <w:color w:val="475569"/>
                 <w:sz w:val="17"/>
               </w:rPr>
-              <w:t>**【午餐：远芳小笼包 ＋ 泉州牛肉羹】**：现包多汁小笼包配鲜滑牛肉羹汤、亚佛润饼菜。</w:t>
+              <w:t>**【午餐：远芳多汁小笼包 ＋ 泉州牛肉羹】**：皮薄汁多小笼包配鲜滑牛肉汤、亚佛润饼菜。</w:t>
             </w:r>
           </w:p>
           <w:p>
@@ -1731,7 +1731,7 @@
                 <w:color w:val="475569"/>
                 <w:sz w:val="17"/>
               </w:rPr>
-              <w:t>**【高铁顺畅返杭】**：乘坐舒适高铁直达杭州东站，19:00 准时到家洗热水澡吃家常晚饭！</w:t>
+              <w:t>**【高铁顺畅返杭】**：乘坐舒适高铁直达杭州东站，19:00 准时到家吃家常晚饭！</w:t>
             </w:r>
           </w:p>
         </w:tc>

</xml_diff>